<commit_message>
fix: change the kvk number in the enrollmentform
Signed-off-by: Wouter van Harten <wouter@woutervanharten.nl>
</commit_message>
<xml_diff>
--- a/traka_automation/enrollments/templates/aanmeldformulier.docx
+++ b/traka_automation/enrollments/templates/aanmeldformulier.docx
@@ -1492,7 +1492,7 @@
         <w:rPr>
           <w:rFonts w:cs="Calibri" w:ascii="Calibri" w:hAnsi="Calibri"/>
         </w:rPr>
-        <w:t xml:space="preserve">Ik neem een ingevuld gezondheidsformulier &lt;link&gt; mee naar het kamp. </w:t>
+        <w:t xml:space="preserve">Ik neem een ingevuld gezondheidsformulier mee naar het kamp. </w:t>
       </w:r>
     </w:p>
     <w:sectPr>
@@ -1803,11 +1803,22 @@
     <w:r>
       <w:rPr>
         <w:rFonts w:cs="Arial" w:ascii="Arial" w:hAnsi="Arial"/>
+        <w:b w:val="false"/>
+        <w:bCs w:val="false"/>
         <w:color w:themeColor="background1" w:val="FFFFFF"/>
         <w:sz w:val="18"/>
         <w:szCs w:val="18"/>
       </w:rPr>
-      <w:t xml:space="preserve">41083077 </w:t>
+      <w:t>99622920</w:t>
+    </w:r>
+    <w:r>
+      <w:rPr>
+        <w:rFonts w:cs="Arial" w:ascii="Arial" w:hAnsi="Arial"/>
+        <w:color w:themeColor="background1" w:val="FFFFFF"/>
+        <w:sz w:val="18"/>
+        <w:szCs w:val="18"/>
+      </w:rPr>
+      <w:t xml:space="preserve"> </w:t>
     </w:r>
     <w:r>
       <w:rPr>
@@ -1875,7 +1886,7 @@
                 <wp:posOffset>635</wp:posOffset>
               </wp:positionH>
               <wp:positionV relativeFrom="paragraph">
-                <wp:posOffset>-463550</wp:posOffset>
+                <wp:posOffset>-462915</wp:posOffset>
               </wp:positionV>
               <wp:extent cx="7566660" cy="3392170"/>
               <wp:effectExtent l="0" t="0" r="0" b="0"/>
@@ -1933,7 +1944,7 @@
               <v:path o:extrusionok="f" gradientshapeok="t" o:connecttype="rect"/>
               <o:lock v:ext="edit" aspectratio="t"/>
             </v:shapetype>
-            <v:shape id="shape_0" stroked="f" o:allowincell="f" style="position:absolute;margin-left:0.05pt;margin-top:-36.55pt;width:595.75pt;height:267.05pt;mso-wrap-style:none;v-text-anchor:middle;rotation:180;mso-position-horizontal-relative:page" wp14:anchorId="53DC8DC0" type="_x0000_t75">
+            <v:shape id="shape_0" stroked="f" o:allowincell="f" style="position:absolute;margin-left:0.05pt;margin-top:-36.5pt;width:595.75pt;height:267.05pt;mso-wrap-style:none;v-text-anchor:middle;rotation:180;mso-position-horizontal-relative:page" wp14:anchorId="53DC8DC0" type="_x0000_t75">
               <v:imagedata r:id="rId2" o:detectmouseclick="t"/>
               <v:stroke color="#3465a4" joinstyle="round" endcap="flat"/>
               <w10:wrap type="none"/>
@@ -1950,7 +1961,7 @@
                 <wp:posOffset>635</wp:posOffset>
               </wp:positionH>
               <wp:positionV relativeFrom="paragraph">
-                <wp:posOffset>-463550</wp:posOffset>
+                <wp:posOffset>-462915</wp:posOffset>
               </wp:positionV>
               <wp:extent cx="7566660" cy="3392170"/>
               <wp:effectExtent l="0" t="0" r="0" b="0"/>
@@ -1989,7 +2000,7 @@
         </mc:Choice>
         <mc:Fallback>
           <w:pict>
-            <v:shape id="shape_0" stroked="f" o:allowincell="f" style="position:absolute;margin-left:0.05pt;margin-top:-36.55pt;width:595.75pt;height:267.05pt;mso-wrap-style:none;v-text-anchor:middle;rotation:180;mso-position-horizontal-relative:page" wp14:anchorId="073C7DBA" type="_x0000_t75">
+            <v:shape id="shape_0" stroked="f" o:allowincell="f" style="position:absolute;margin-left:0.05pt;margin-top:-36.5pt;width:595.75pt;height:267.05pt;mso-wrap-style:none;v-text-anchor:middle;rotation:180;mso-position-horizontal-relative:page" wp14:anchorId="073C7DBA" type="_x0000_t75">
               <v:imagedata r:id="rId4" o:detectmouseclick="t"/>
               <v:stroke color="#3465a4" joinstyle="round" endcap="flat"/>
               <w10:wrap type="none"/>
@@ -2106,10 +2117,10 @@
             <wp:anchor distT="0" distB="0" distL="0" distR="0" simplePos="0" relativeHeight="2" behindDoc="1" locked="0" layoutInCell="1" allowOverlap="1" wp14:anchorId="2C8921AD">
               <wp:simplePos x="0" y="0"/>
               <wp:positionH relativeFrom="column">
-                <wp:posOffset>-903605</wp:posOffset>
+                <wp:posOffset>-902970</wp:posOffset>
               </wp:positionH>
               <wp:positionV relativeFrom="paragraph">
-                <wp:posOffset>-494030</wp:posOffset>
+                <wp:posOffset>-493395</wp:posOffset>
               </wp:positionV>
               <wp:extent cx="7566660" cy="3392170"/>
               <wp:effectExtent l="0" t="0" r="0" b="0"/>
@@ -2148,7 +2159,7 @@
         </mc:Choice>
         <mc:Fallback>
           <w:pict>
-            <v:shape id="shape_0" stroked="f" o:allowincell="f" style="position:absolute;margin-left:-71.2pt;margin-top:-38.95pt;width:595.75pt;height:267.05pt;mso-wrap-style:none;v-text-anchor:middle;rotation:180" wp14:anchorId="2C8921AD" type="_x0000_t75">
+            <v:shape id="shape_0" stroked="f" o:allowincell="f" style="position:absolute;margin-left:-71.15pt;margin-top:-38.9pt;width:595.75pt;height:267.05pt;mso-wrap-style:none;v-text-anchor:middle;rotation:180" wp14:anchorId="2C8921AD" type="_x0000_t75">
               <v:imagedata r:id="rId2" o:detectmouseclick="t"/>
               <v:stroke color="#3465a4" joinstyle="round" endcap="flat"/>
               <w10:wrap type="none"/>

</xml_diff>

<commit_message>
fix: change the kvk number in the enrollmentform (#60)
Signed-off-by: Wouter van Harten <wouter@woutervanharten.nl>
</commit_message>
<xml_diff>
--- a/traka_automation/enrollments/templates/aanmeldformulier.docx
+++ b/traka_automation/enrollments/templates/aanmeldformulier.docx
@@ -1492,7 +1492,7 @@
         <w:rPr>
           <w:rFonts w:cs="Calibri" w:ascii="Calibri" w:hAnsi="Calibri"/>
         </w:rPr>
-        <w:t xml:space="preserve">Ik neem een ingevuld gezondheidsformulier &lt;link&gt; mee naar het kamp. </w:t>
+        <w:t xml:space="preserve">Ik neem een ingevuld gezondheidsformulier mee naar het kamp. </w:t>
       </w:r>
     </w:p>
     <w:sectPr>
@@ -1803,11 +1803,22 @@
     <w:r>
       <w:rPr>
         <w:rFonts w:cs="Arial" w:ascii="Arial" w:hAnsi="Arial"/>
+        <w:b w:val="false"/>
+        <w:bCs w:val="false"/>
         <w:color w:themeColor="background1" w:val="FFFFFF"/>
         <w:sz w:val="18"/>
         <w:szCs w:val="18"/>
       </w:rPr>
-      <w:t xml:space="preserve">41083077 </w:t>
+      <w:t>99622920</w:t>
+    </w:r>
+    <w:r>
+      <w:rPr>
+        <w:rFonts w:cs="Arial" w:ascii="Arial" w:hAnsi="Arial"/>
+        <w:color w:themeColor="background1" w:val="FFFFFF"/>
+        <w:sz w:val="18"/>
+        <w:szCs w:val="18"/>
+      </w:rPr>
+      <w:t xml:space="preserve"> </w:t>
     </w:r>
     <w:r>
       <w:rPr>
@@ -1875,7 +1886,7 @@
                 <wp:posOffset>635</wp:posOffset>
               </wp:positionH>
               <wp:positionV relativeFrom="paragraph">
-                <wp:posOffset>-463550</wp:posOffset>
+                <wp:posOffset>-462915</wp:posOffset>
               </wp:positionV>
               <wp:extent cx="7566660" cy="3392170"/>
               <wp:effectExtent l="0" t="0" r="0" b="0"/>
@@ -1933,7 +1944,7 @@
               <v:path o:extrusionok="f" gradientshapeok="t" o:connecttype="rect"/>
               <o:lock v:ext="edit" aspectratio="t"/>
             </v:shapetype>
-            <v:shape id="shape_0" stroked="f" o:allowincell="f" style="position:absolute;margin-left:0.05pt;margin-top:-36.55pt;width:595.75pt;height:267.05pt;mso-wrap-style:none;v-text-anchor:middle;rotation:180;mso-position-horizontal-relative:page" wp14:anchorId="53DC8DC0" type="_x0000_t75">
+            <v:shape id="shape_0" stroked="f" o:allowincell="f" style="position:absolute;margin-left:0.05pt;margin-top:-36.5pt;width:595.75pt;height:267.05pt;mso-wrap-style:none;v-text-anchor:middle;rotation:180;mso-position-horizontal-relative:page" wp14:anchorId="53DC8DC0" type="_x0000_t75">
               <v:imagedata r:id="rId2" o:detectmouseclick="t"/>
               <v:stroke color="#3465a4" joinstyle="round" endcap="flat"/>
               <w10:wrap type="none"/>
@@ -1950,7 +1961,7 @@
                 <wp:posOffset>635</wp:posOffset>
               </wp:positionH>
               <wp:positionV relativeFrom="paragraph">
-                <wp:posOffset>-463550</wp:posOffset>
+                <wp:posOffset>-462915</wp:posOffset>
               </wp:positionV>
               <wp:extent cx="7566660" cy="3392170"/>
               <wp:effectExtent l="0" t="0" r="0" b="0"/>
@@ -1989,7 +2000,7 @@
         </mc:Choice>
         <mc:Fallback>
           <w:pict>
-            <v:shape id="shape_0" stroked="f" o:allowincell="f" style="position:absolute;margin-left:0.05pt;margin-top:-36.55pt;width:595.75pt;height:267.05pt;mso-wrap-style:none;v-text-anchor:middle;rotation:180;mso-position-horizontal-relative:page" wp14:anchorId="073C7DBA" type="_x0000_t75">
+            <v:shape id="shape_0" stroked="f" o:allowincell="f" style="position:absolute;margin-left:0.05pt;margin-top:-36.5pt;width:595.75pt;height:267.05pt;mso-wrap-style:none;v-text-anchor:middle;rotation:180;mso-position-horizontal-relative:page" wp14:anchorId="073C7DBA" type="_x0000_t75">
               <v:imagedata r:id="rId4" o:detectmouseclick="t"/>
               <v:stroke color="#3465a4" joinstyle="round" endcap="flat"/>
               <w10:wrap type="none"/>
@@ -2106,10 +2117,10 @@
             <wp:anchor distT="0" distB="0" distL="0" distR="0" simplePos="0" relativeHeight="2" behindDoc="1" locked="0" layoutInCell="1" allowOverlap="1" wp14:anchorId="2C8921AD">
               <wp:simplePos x="0" y="0"/>
               <wp:positionH relativeFrom="column">
-                <wp:posOffset>-903605</wp:posOffset>
+                <wp:posOffset>-902970</wp:posOffset>
               </wp:positionH>
               <wp:positionV relativeFrom="paragraph">
-                <wp:posOffset>-494030</wp:posOffset>
+                <wp:posOffset>-493395</wp:posOffset>
               </wp:positionV>
               <wp:extent cx="7566660" cy="3392170"/>
               <wp:effectExtent l="0" t="0" r="0" b="0"/>
@@ -2148,7 +2159,7 @@
         </mc:Choice>
         <mc:Fallback>
           <w:pict>
-            <v:shape id="shape_0" stroked="f" o:allowincell="f" style="position:absolute;margin-left:-71.2pt;margin-top:-38.95pt;width:595.75pt;height:267.05pt;mso-wrap-style:none;v-text-anchor:middle;rotation:180" wp14:anchorId="2C8921AD" type="_x0000_t75">
+            <v:shape id="shape_0" stroked="f" o:allowincell="f" style="position:absolute;margin-left:-71.15pt;margin-top:-38.9pt;width:595.75pt;height:267.05pt;mso-wrap-style:none;v-text-anchor:middle;rotation:180" wp14:anchorId="2C8921AD" type="_x0000_t75">
               <v:imagedata r:id="rId2" o:detectmouseclick="t"/>
               <v:stroke color="#3465a4" joinstyle="round" endcap="flat"/>
               <w10:wrap type="none"/>

</xml_diff>